<commit_message>
docs: describe the real Dishboard state, deployment and evidence
- Schema version 12, migrations 0001-0009 with bootstrap and app-role grants
- Local auth with bootstrap-local-admin + provision-local-user workflow
- 28 tables, live screenshot evidence (18 files), validator integration
- Deployment: port 8789, image ID format, 10.213.0.0/24 network, secrets hardening
- 2199 passed, 14 skipped on integration line; restore drills, compose probes, validators
- Updated: README (bootstrap commands, health endpoints), VALIDATION (evidence table),
  CHANGELOG (2026-09-02 entry), SDD (auth/deployment/schema sections), database/README
  (migration chain 0001-0009), deployment/README (port, image ID, no fixed app IP),
  GROK_KRITIK_UMSETZUNG (live testing status), SCREENSHOT_INDEX (live screenshots),
  design/SCREENSHOT_INDEX (18 live + capture tool), DOCX regenerated

Co-Authored-By: Claude Fable 5.1 <noreply@anthropic.com>
</commit_message>
<xml_diff>
--- a/docs/SDD_Klinik_Suedhang_Cafeteria_v3.0.docx
+++ b/docs/SDD_Klinik_Suedhang_Cafeteria_v3.0.docx
@@ -8058,6 +8058,139 @@
         <w:t>Rollen und Anmeldung</w:t>
       </w:r>
     </w:p>
+    <w:p>
+      <w:r>
+        <w:rPr>
+          <w:rFonts w:ascii="Aptos" w:hAnsi="Aptos" w:eastAsia="Aptos"/>
+        </w:rPr>
+        <w:t>Das Backend unterstützt zwei Auth-Provider: Microsoft Entra ID (optional, produktiv) und lokale Benutzer (standardmäßig aktiviert).</w:t>
+      </w:r>
+    </w:p>
+    <w:p>
+      <w:pPr>
+        <w:pStyle w:val="Heading2"/>
+      </w:pPr>
+      <w:r>
+        <w:rPr>
+          <w:rFonts w:ascii="Aptos" w:hAnsi="Aptos" w:eastAsia="Aptos"/>
+          <w:color w:val="2F6768"/>
+          <w:sz w:val="26"/>
+        </w:rPr>
+        <w:t>Lokale Benutzer</w:t>
+      </w:r>
+    </w:p>
+    <w:p>
+      <w:r>
+        <w:rPr>
+          <w:rFonts w:ascii="Aptos" w:hAnsi="Aptos" w:eastAsia="Aptos"/>
+        </w:rPr>
+        <w:t xml:space="preserve">Die erste lokale Administration wird mit </w:t>
+      </w:r>
+      <w:r>
+        <w:rPr>
+          <w:rFonts w:ascii="Liberation Mono" w:hAnsi="Liberation Mono" w:eastAsia="Liberation Mono"/>
+          <w:color w:val="173B3F"/>
+          <w:sz w:val="18"/>
+        </w:rPr>
+        <w:t>python manage.py bootstrap-local-admin --username X --display-name Y</w:t>
+      </w:r>
+      <w:r>
+        <w:rPr>
+          <w:rFonts w:ascii="Aptos" w:hAnsi="Aptos" w:eastAsia="Aptos"/>
+        </w:rPr>
+        <w:t xml:space="preserve"> auf der Owner-Datenbankverbindung bereitgestellt. Passwörter werden zweimal interaktiv abgefragt oder aus </w:t>
+      </w:r>
+      <w:r>
+        <w:rPr>
+          <w:rFonts w:ascii="Liberation Mono" w:hAnsi="Liberation Mono" w:eastAsia="Liberation Mono"/>
+          <w:color w:val="173B3F"/>
+          <w:sz w:val="18"/>
+        </w:rPr>
+        <w:t>DISHBOARD_BOOTSTRAP_PASSWORD_FILE</w:t>
+      </w:r>
+      <w:r>
+        <w:rPr>
+          <w:rFonts w:ascii="Aptos" w:hAnsi="Aptos" w:eastAsia="Aptos"/>
+        </w:rPr>
+        <w:t xml:space="preserve"> (Modus 0400) gelesen. Weitere Benutzer werden von verifizierten Administratoren provisioniert: </w:t>
+      </w:r>
+      <w:r>
+        <w:rPr>
+          <w:rFonts w:ascii="Liberation Mono" w:hAnsi="Liberation Mono" w:eastAsia="Liberation Mono"/>
+          <w:color w:val="173B3F"/>
+          <w:sz w:val="18"/>
+        </w:rPr>
+        <w:t>python manage.py provision-local-user --actor &lt;admin&gt; --username ... --display-name ... --role Cafeteria.Editor|Publisher|Admin</w:t>
+      </w:r>
+      <w:r>
+        <w:rPr>
+          <w:rFonts w:ascii="Aptos" w:hAnsi="Aptos" w:eastAsia="Aptos"/>
+        </w:rPr>
+        <w:t>. Passwort-Änderungen und Deaktivierungen erfolgen ebenfalls über diese verifizierten Administratoren.</w:t>
+      </w:r>
+    </w:p>
+    <w:p>
+      <w:pPr>
+        <w:pStyle w:val="Heading2"/>
+      </w:pPr>
+      <w:r>
+        <w:rPr>
+          <w:rFonts w:ascii="Aptos" w:hAnsi="Aptos" w:eastAsia="Aptos"/>
+          <w:color w:val="2F6768"/>
+          <w:sz w:val="26"/>
+        </w:rPr>
+        <w:t>Microsoft Entra ID (Optional)</w:t>
+      </w:r>
+    </w:p>
+    <w:p>
+      <w:r>
+        <w:rPr>
+          <w:rFonts w:ascii="Aptos" w:hAnsi="Aptos" w:eastAsia="Aptos"/>
+        </w:rPr>
+        <w:t xml:space="preserve">Bei </w:t>
+      </w:r>
+      <w:r>
+        <w:rPr>
+          <w:rFonts w:ascii="Liberation Mono" w:hAnsi="Liberation Mono" w:eastAsia="Liberation Mono"/>
+          <w:color w:val="173B3F"/>
+          <w:sz w:val="18"/>
+        </w:rPr>
+        <w:t>ENTRA_ENABLED=true</w:t>
+      </w:r>
+      <w:r>
+        <w:rPr>
+          <w:rFonts w:ascii="Aptos" w:hAnsi="Aptos" w:eastAsia="Aptos"/>
+        </w:rPr>
+        <w:t xml:space="preserve"> wird der Authorization Code Flow mit Single-Tenant-Setup genutzt. Nur zugewiesene Benutzer oder Gruppen erhalten Backendzugriff. Rollen werden aus dem </w:t>
+      </w:r>
+      <w:r>
+        <w:rPr>
+          <w:rFonts w:ascii="Liberation Mono" w:hAnsi="Liberation Mono" w:eastAsia="Liberation Mono"/>
+          <w:color w:val="173B3F"/>
+          <w:sz w:val="18"/>
+        </w:rPr>
+        <w:t>roles</w:t>
+      </w:r>
+      <w:r>
+        <w:rPr>
+          <w:rFonts w:ascii="Aptos" w:hAnsi="Aptos" w:eastAsia="Aptos"/>
+        </w:rPr>
+        <w:t>-Claim gelesen und auf lokale Rollen synchronisiert. Entra ist deaktiviert, bis Tenant-ID, Client-ID und Client Secret konfiguriert sind.</w:t>
+      </w:r>
+    </w:p>
+    <w:p>
+      <w:pPr>
+        <w:pStyle w:val="Heading2"/>
+      </w:pPr>
+      <w:r>
+        <w:rPr>
+          <w:rFonts w:ascii="Aptos" w:hAnsi="Aptos" w:eastAsia="Aptos"/>
+          <w:color w:val="2F6768"/>
+          <w:sz w:val="26"/>
+        </w:rPr>
+        <w:t>Rollen</w:t>
+      </w:r>
+    </w:p>
     <w:tbl>
       <w:tblPr>
         <w:tblStyle w:val="TableGrid"/>
@@ -8352,7 +8485,21 @@
         <w:rPr>
           <w:rFonts w:ascii="Aptos" w:hAnsi="Aptos" w:eastAsia="Aptos"/>
         </w:rPr>
-        <w:t>Keine lokalen Produktionspasswörter; Entra für das Backend.</w:t>
+        <w:t xml:space="preserve">Authentifizierung lokal oder optional über Entra; serverseitige Rollen-Autorisierung; lokale Passwörter gehasht (scrypt/pbkdf2); Entra-Rollen synchronisiert aus der </w:t>
+      </w:r>
+      <w:r>
+        <w:rPr>
+          <w:rFonts w:ascii="Liberation Mono" w:hAnsi="Liberation Mono" w:eastAsia="Liberation Mono"/>
+          <w:color w:val="173B3F"/>
+          <w:sz w:val="18"/>
+        </w:rPr>
+        <w:t>roles</w:t>
+      </w:r>
+      <w:r>
+        <w:rPr>
+          <w:rFonts w:ascii="Aptos" w:hAnsi="Aptos" w:eastAsia="Aptos"/>
+        </w:rPr>
+        <w:t>-Claim.</w:t>
       </w:r>
     </w:p>
     <w:p>
@@ -8591,6 +8738,68 @@
         <w:t>Systemarchitektur</w:t>
       </w:r>
     </w:p>
+    <w:p>
+      <w:pPr>
+        <w:pStyle w:val="Heading2"/>
+      </w:pPr>
+      <w:r>
+        <w:rPr>
+          <w:rFonts w:ascii="Aptos" w:hAnsi="Aptos" w:eastAsia="Aptos"/>
+          <w:color w:val="2F6768"/>
+          <w:sz w:val="26"/>
+        </w:rPr>
+        <w:t>Datenbank und Schema</w:t>
+      </w:r>
+    </w:p>
+    <w:p>
+      <w:r>
+        <w:rPr>
+          <w:rFonts w:ascii="Aptos" w:hAnsi="Aptos" w:eastAsia="Aptos"/>
+        </w:rPr>
+        <w:t>PostgreSQL 18.6 mit Schema-Version 12 (Migrationen 0001–0009 mit SHA-256-Validierung). SQL-Baseline (</w:t>
+      </w:r>
+      <w:r>
+        <w:rPr>
+          <w:rFonts w:ascii="Liberation Mono" w:hAnsi="Liberation Mono" w:eastAsia="Liberation Mono"/>
+          <w:color w:val="173B3F"/>
+          <w:sz w:val="18"/>
+        </w:rPr>
+        <w:t>database/schema.sql</w:t>
+      </w:r>
+      <w:r>
+        <w:rPr>
+          <w:rFonts w:ascii="Aptos" w:hAnsi="Aptos" w:eastAsia="Aptos"/>
+        </w:rPr>
+        <w:t xml:space="preserve">) und </w:t>
+      </w:r>
+      <w:r>
+        <w:rPr>
+          <w:rFonts w:ascii="Liberation Mono" w:hAnsi="Liberation Mono" w:eastAsia="Liberation Mono"/>
+          <w:color w:val="173B3F"/>
+          <w:sz w:val="18"/>
+        </w:rPr>
+        <w:t>0001_initial_postgresql.sql</w:t>
+      </w:r>
+      <w:r>
+        <w:rPr>
+          <w:rFonts w:ascii="Aptos" w:hAnsi="Aptos" w:eastAsia="Aptos"/>
+        </w:rPr>
+        <w:t xml:space="preserve"> sind byteidentisch. Alle Triggers, Funktionen und Constraints sind in der SQL-Baseline definiert; das Paket nutzt kein Alembic.</w:t>
+      </w:r>
+    </w:p>
+    <w:p>
+      <w:pPr>
+        <w:pStyle w:val="Heading2"/>
+      </w:pPr>
+      <w:r>
+        <w:rPr>
+          <w:rFonts w:ascii="Aptos" w:hAnsi="Aptos" w:eastAsia="Aptos"/>
+          <w:color w:val="2F6768"/>
+          <w:sz w:val="26"/>
+        </w:rPr>
+        <w:t>Docker-Services</w:t>
+      </w:r>
+    </w:p>
     <w:tbl>
       <w:tblPr>
         <w:tblStyle w:val="TableGrid"/>
@@ -8713,7 +8922,7 @@
                 <w:color w:val="172A2D"/>
                 <w:sz w:val="16"/>
               </w:rPr>
-              <w:t>PostgreSQL und Constraints</w:t>
+              <w:t>PostgreSQL 18.6 mit Constraints und Audit</w:t>
             </w:r>
           </w:p>
         </w:tc>
@@ -8770,7 +8979,7 @@
                 <w:color w:val="172A2D"/>
                 <w:sz w:val="16"/>
               </w:rPr>
-              <w:t>Serverseitige Sessions</w:t>
+              <w:t>Redis 7.4 für Serverseitige Sessions (UID 999:1000)</w:t>
             </w:r>
           </w:p>
         </w:tc>
@@ -8825,7 +9034,7 @@
                 <w:color w:val="172A2D"/>
                 <w:sz w:val="16"/>
               </w:rPr>
-              <w:t>Versionierte SQL-Baseline, Seed und Rechte</w:t>
+              <w:t>Versionierte SQL-Baseline, Seed, Permissions und Capability-Reset (UID 10001)</w:t>
             </w:r>
           </w:p>
         </w:tc>
@@ -8882,7 +9091,7 @@
                 <w:color w:val="172A2D"/>
                 <w:sz w:val="16"/>
               </w:rPr>
-              <w:t>Flask/Gunicorn; zwei Worker sind Betriebswert, kein Skalierungsnachweis</w:t>
+              <w:t>Flask 3 + Gunicorn 26 auf 127.0.0.1:8789 (UID 10001); zwei Worker sind Betriebswert, kein Skalierungsnachweis</w:t>
             </w:r>
           </w:p>
         </w:tc>
@@ -8953,7 +9162,7 @@
                 <w:color w:val="172A2D"/>
                 <w:sz w:val="16"/>
               </w:rPr>
-              <w:t xml:space="preserve"> mit Hash und Manifest</w:t>
+              <w:t xml:space="preserve"> mit Secrets-Ausschlüssen, Hash und Manifest</w:t>
             </w:r>
           </w:p>
         </w:tc>
@@ -9020,6 +9229,14 @@
               </w:rPr>
               <w:t>ops</w:t>
             </w:r>
+            <w:r>
+              <w:rPr>
+                <w:rFonts w:ascii="Aptos" w:hAnsi="Aptos" w:eastAsia="Aptos"/>
+                <w:color w:val="172A2D"/>
+                <w:sz w:val="16"/>
+              </w:rPr>
+              <w:t>; Kandidaten-DB, Lease-Akquise, Lifecycle-Atomarität</w:t>
+            </w:r>
           </w:p>
         </w:tc>
       </w:tr>
@@ -9030,11 +9247,82 @@
       </w:pPr>
     </w:p>
     <w:p>
+      <w:pPr>
+        <w:pStyle w:val="Heading2"/>
+      </w:pPr>
+      <w:r>
+        <w:rPr>
+          <w:rFonts w:ascii="Aptos" w:hAnsi="Aptos" w:eastAsia="Aptos"/>
+          <w:color w:val="2F6768"/>
+          <w:sz w:val="26"/>
+        </w:rPr>
+        <w:t>Deployment</w:t>
+      </w:r>
+    </w:p>
+    <w:p>
       <w:r>
         <w:rPr>
           <w:rFonts w:ascii="Aptos" w:hAnsi="Aptos" w:eastAsia="Aptos"/>
         </w:rPr>
-        <w:t>Öffentliche Player aktualisieren alle 300 Sekunden. Der Reverse Proxy terminiert TLS. Backupkopien müssen ausserhalb des Docker-Hosts repliziert werden. Restore, PostgreSQL-Start, Entra-Anmeldung und Signage-Dauerlauf sind vor Produktion auf Staging nachzuweisen.</w:t>
+        <w:t>Netzwerk 10.213.0.0/24 (ausserhalb Docker-Defaults 172.16.0.0/12 und 192.168.0.0/16) mit Gateway 10.213.0.1 und optionalem Compose-Caddy-Overlay auf 10.213.0.10. App hat keine feste interne IP; Host-Proxy erreicht sie über Loopback-Port 127.0.0.1:8789.</w:t>
+      </w:r>
+    </w:p>
+    <w:p>
+      <w:r>
+        <w:rPr>
+          <w:rFonts w:ascii="Aptos" w:hAnsi="Aptos" w:eastAsia="Aptos"/>
+        </w:rPr>
+        <w:t xml:space="preserve">Secrets als 0700-root-Verzeichnis mit 0444-Dateien pro Service (kein </w:t>
+      </w:r>
+      <w:r>
+        <w:rPr>
+          <w:rFonts w:ascii="Liberation Mono" w:hAnsi="Liberation Mono" w:eastAsia="Liberation Mono"/>
+          <w:color w:val="173B3F"/>
+          <w:sz w:val="18"/>
+        </w:rPr>
+        <w:t>.env</w:t>
+      </w:r>
+      <w:r>
+        <w:rPr>
+          <w:rFonts w:ascii="Aptos" w:hAnsi="Aptos" w:eastAsia="Aptos"/>
+        </w:rPr>
+        <w:t xml:space="preserve">, kein Git). Image-ID fixiert als APP_IMAGE=sha256:&lt;64hex&gt; (kein Registry-Digest, kein Tag). Bootstrap-Phase mit </w:t>
+      </w:r>
+      <w:r>
+        <w:rPr>
+          <w:rFonts w:ascii="Liberation Mono" w:hAnsi="Liberation Mono" w:eastAsia="Liberation Mono"/>
+          <w:color w:val="173B3F"/>
+          <w:sz w:val="18"/>
+        </w:rPr>
+        <w:t>APP_ENV=migration</w:t>
+      </w:r>
+      <w:r>
+        <w:rPr>
+          <w:rFonts w:ascii="Aptos" w:hAnsi="Aptos" w:eastAsia="Aptos"/>
+        </w:rPr>
+        <w:t xml:space="preserve"> erhält nur PostgreSQL-Secrets. Healthchecks nutzen Shell-Ausführung ohne Secrets als Kommando-Argumente.</w:t>
+      </w:r>
+    </w:p>
+    <w:p>
+      <w:r>
+        <w:rPr>
+          <w:rFonts w:ascii="Aptos" w:hAnsi="Aptos" w:eastAsia="Aptos"/>
+        </w:rPr>
+        <w:t xml:space="preserve">Öffentliche Player aktualisieren alle 300 Sekunden. Der Reverse Proxy (Caddy) terminiert TLS und proxyt auf 127.0.0.1:8789. Nur das Gateway 10.213.0.1 darf </w:t>
+      </w:r>
+      <w:r>
+        <w:rPr>
+          <w:rFonts w:ascii="Liberation Mono" w:hAnsi="Liberation Mono" w:eastAsia="Liberation Mono"/>
+          <w:color w:val="173B3F"/>
+          <w:sz w:val="18"/>
+        </w:rPr>
+        <w:t>X-Forwarded-For</w:t>
+      </w:r>
+      <w:r>
+        <w:rPr>
+          <w:rFonts w:ascii="Aptos" w:hAnsi="Aptos" w:eastAsia="Aptos"/>
+        </w:rPr>
+        <w:t xml:space="preserve"> liefern. Backupkopien müssen ausserhalb des Docker-Hosts repliziert werden.</w:t>
       </w:r>
     </w:p>
     <w:p>
@@ -9408,6 +9696,128 @@
           <w:sz w:val="26"/>
         </w:rPr>
         <w:t>Im Paket automatisiert geprüft</w:t>
+      </w:r>
+    </w:p>
+    <w:p>
+      <w:pPr>
+        <w:pStyle w:val="ListBullet"/>
+        <w:spacing w:after="40"/>
+      </w:pPr>
+      <w:r>
+        <w:rPr>
+          <w:rFonts w:ascii="Aptos" w:hAnsi="Aptos" w:eastAsia="Aptos"/>
+        </w:rPr>
+        <w:t>Schema-Version 12 mit Migrationen 0001–0009; SQL-Baseline byteidentisch.</w:t>
+      </w:r>
+    </w:p>
+    <w:p>
+      <w:pPr>
+        <w:pStyle w:val="ListBullet"/>
+        <w:spacing w:after="40"/>
+      </w:pPr>
+      <w:r>
+        <w:rPr>
+          <w:rFonts w:ascii="Aptos" w:hAnsi="Aptos" w:eastAsia="Aptos"/>
+        </w:rPr>
+        <w:t>Zwei Profile, 28 Tabellen, fünf Cafeteria-Services, 14 Patienten-Services und 28 Patientenoptionen in den Demo-Daten.</w:t>
+      </w:r>
+    </w:p>
+    <w:p>
+      <w:pPr>
+        <w:pStyle w:val="ListBullet"/>
+        <w:spacing w:after="40"/>
+      </w:pPr>
+      <w:r>
+        <w:rPr>
+          <w:rFonts w:ascii="Aptos" w:hAnsi="Aptos" w:eastAsia="Aptos"/>
+        </w:rPr>
+        <w:t xml:space="preserve">Patienten-Snapshot und -CSV enthalten keine Kosten-Schlüssel oder Kostenfelder; </w:t>
+      </w:r>
+      <w:r>
+        <w:rPr>
+          <w:rFonts w:ascii="Liberation Mono" w:hAnsi="Liberation Mono" w:eastAsia="Liberation Mono"/>
+          <w:color w:val="173B3F"/>
+          <w:sz w:val="18"/>
+        </w:rPr>
+        <w:t>cafeteria_app</w:t>
+      </w:r>
+      <w:r>
+        <w:rPr>
+          <w:rFonts w:ascii="Aptos" w:hAnsi="Aptos" w:eastAsia="Aptos"/>
+        </w:rPr>
+        <w:t xml:space="preserve"> erhält EXECUTE auf Validator-Funktionen.</w:t>
+      </w:r>
+    </w:p>
+    <w:p>
+      <w:pPr>
+        <w:pStyle w:val="ListBullet"/>
+        <w:spacing w:after="40"/>
+      </w:pPr>
+      <w:r>
+        <w:rPr>
+          <w:rFonts w:ascii="Aptos" w:hAnsi="Aptos" w:eastAsia="Aptos"/>
+        </w:rPr>
+        <w:t>Beide CSV-Beispiele erfüllen ihr jeweiliges Profilformat; Normaliserungsfunktionen prüfen auch Patientenkosten-Homoglyphen.</w:t>
+      </w:r>
+    </w:p>
+    <w:p>
+      <w:pPr>
+        <w:pStyle w:val="ListBullet"/>
+        <w:spacing w:after="40"/>
+      </w:pPr>
+      <w:r>
+        <w:rPr>
+          <w:rFonts w:ascii="Aptos" w:hAnsi="Aptos" w:eastAsia="Aptos"/>
+        </w:rPr>
+        <w:t>Alle Jinja-Templates sind syntaktisch parsebar; getrennte Patienten- und Cafeteria-Templates.</w:t>
+      </w:r>
+    </w:p>
+    <w:p>
+      <w:pPr>
+        <w:pStyle w:val="ListBullet"/>
+        <w:spacing w:after="40"/>
+      </w:pPr>
+      <w:r>
+        <w:rPr>
+          <w:rFonts w:ascii="Aptos" w:hAnsi="Aptos" w:eastAsia="Aptos"/>
+        </w:rPr>
+        <w:t>Vier feste Signage-Routen sind vorhanden und öffentliche Datumsparameter fehlen; Last-Good-Snapshots für Fehlerbetrieb.</w:t>
+      </w:r>
+    </w:p>
+    <w:p>
+      <w:pPr>
+        <w:pStyle w:val="ListBullet"/>
+        <w:spacing w:after="40"/>
+      </w:pPr>
+      <w:r>
+        <w:rPr>
+          <w:rFonts w:ascii="Aptos" w:hAnsi="Aptos" w:eastAsia="Aptos"/>
+        </w:rPr>
+        <w:t>14 primäre Screenshots und 18 Live-Screenshots mit INDEX.json; Pixelmasse und nichtleerer Bildinhalt geprüft.</w:t>
+      </w:r>
+    </w:p>
+    <w:p>
+      <w:pPr>
+        <w:pStyle w:val="ListBullet"/>
+        <w:spacing w:after="40"/>
+      </w:pPr>
+      <w:r>
+        <w:rPr>
+          <w:rFonts w:ascii="Aptos" w:hAnsi="Aptos" w:eastAsia="Aptos"/>
+        </w:rPr>
+        <w:t>DOT-Diagramme werden als PNG und SVG gerendert.</w:t>
+      </w:r>
+    </w:p>
+    <w:p>
+      <w:pPr>
+        <w:pStyle w:val="ListBullet"/>
+        <w:spacing w:after="40"/>
+      </w:pPr>
+      <w:r>
+        <w:rPr>
+          <w:rFonts w:ascii="Aptos" w:hAnsi="Aptos" w:eastAsia="Aptos"/>
+        </w:rPr>
+        <w:t>Validator (tools/validate_package.py): 2199 passed, 14 skipped (Restore-Drill); alle SDD-, README-, Rolle-, Snapshot-, CSV-, Diagram-Checks OK.</w:t>
       </w:r>
     </w:p>
     <w:p>

</xml_diff>